<commit_message>
SWDY: sync the live download files with the EGP-equivalent Kd correction
files/ (what the live ticker page actually serves) was stale relative to
engine/swdy_study/ after the previous commit: the study document, model and
bibliography behind the "Open the study" button predated the EGP-equivalent
cost-of-debt disclosure and its devaluation-risk caution.

Copies synced (docx, pdf, xlsx, bibliography docx + pdf), verified byte-
identical to the engine/swdy_study source. Cache-buster bumped 0806 -> 0806b on
all four data.js file links so browsers don't serve the cached pre-correction
copies. Verified by render: loaded swdy.html headless and confirmed all three
download links resolve to the new files with the new token. Both static gates
clean.

Co-Authored-By: Claude Opus 5 <noreply@anthropic.com>
Claude-Session: https://claude.ai/code/session_01PWDfUDMDBQnaLEd5WQ7Eae
</commit_message>
<xml_diff>
--- a/files/SWDY_Valuation_Study_05-08-2026_public.docx
+++ b/files/SWDY_Valuation_Study_05-08-2026_public.docx
@@ -12376,7 +12376,7 @@
           <w:color w:val="1C3A36"/>
           <w:sz w:val="21"/>
         </w:rPr>
-        <w:t>Four choices in the cost of capital above are legitimately arguable, and external reviewers have argued them. Rather than defend each in prose, each alternative is computed and its value published here, so a reader who prefers a different convention can take the number directly.</w:t>
+        <w:t>Five choices in the cost of capital above are legitimately arguable, and external reviewers have argued them. Rather than defend each in prose, each alternative is computed and its value published here, so a reader who prefers a different convention can take the number directly.</w:t>
       </w:r>
     </w:p>
     <w:tbl>
@@ -12700,6 +12700,79 @@
                 <w:sz w:val="16"/>
               </w:rPr>
               <w:t>Net debt is the quantity the bridge subtracts; using it in both places keeps the two consistent, and it is the more conservative of the two</w:t>
+            </w:r>
+          </w:p>
+        </w:tc>
+      </w:tr>
+      <w:tr>
+        <w:tc>
+          <w:tcPr>
+            <w:tcW w:type="dxa" w:w="2477"/>
+          </w:tcPr>
+          <w:p>
+            <w:pPr>
+              <w:spacing w:after="20"/>
+            </w:pPr>
+            <w:r>
+              <w:rPr>
+                <w:color w:val="1C3A36"/>
+                <w:sz w:val="16"/>
+              </w:rPr>
+              <w:t>Cost of debt on currency composition (13.0%): the disclosed coupon on each currency leg, unadjusted</w:t>
+            </w:r>
+          </w:p>
+        </w:tc>
+        <w:tc>
+          <w:tcPr>
+            <w:tcW w:type="dxa" w:w="2664"/>
+          </w:tcPr>
+          <w:p>
+            <w:pPr>
+              <w:spacing w:after="20"/>
+              <w:jc w:val="right"/>
+            </w:pPr>
+            <w:r>
+              <w:rPr>
+                <w:color w:val="1C3A36"/>
+                <w:sz w:val="16"/>
+              </w:rPr>
+              <w:t>EGP-equivalent (18.7%): the hard-currency legs loaded with the pound's own 5.4%/year forecast depreciation, under uncovered interest parity</w:t>
+            </w:r>
+          </w:p>
+        </w:tc>
+        <w:tc>
+          <w:tcPr>
+            <w:tcW w:type="dxa" w:w="1843"/>
+          </w:tcPr>
+          <w:p>
+            <w:pPr>
+              <w:spacing w:after="20"/>
+              <w:jc w:val="right"/>
+            </w:pPr>
+            <w:r>
+              <w:rPr>
+                <w:color w:val="1C3A36"/>
+                <w:sz w:val="16"/>
+              </w:rPr>
+              <w:t>EGP 62.69 (-0.41)</w:t>
+            </w:r>
+          </w:p>
+        </w:tc>
+        <w:tc>
+          <w:tcPr>
+            <w:tcW w:type="dxa" w:w="3096"/>
+          </w:tcPr>
+          <w:p>
+            <w:pPr>
+              <w:spacing w:after="20"/>
+              <w:jc w:val="right"/>
+            </w:pPr>
+            <w:r>
+              <w:rPr>
+                <w:color w:val="1C3A36"/>
+                <w:sz w:val="16"/>
+              </w:rPr>
+              <w:t>Net debt carries only 8.1% of the capital structure, so even this 660-basis-point swing in Kd moves the fair value by well under 1% — smaller than it looks. CAUTION: keeping the currency-composition basis as primary means the hard-currency debt is carried at its coupon rate, not compensated for devaluation risk beyond what this forecast's own exchange-rate path already assumes</w:t>
             </w:r>
           </w:p>
         </w:tc>

</xml_diff>